<commit_message>
Harden template docs, tests, and secure pipeline
</commit_message>
<xml_diff>
--- a/output/template_code_project/docx/template_code_project_combined.docx
+++ b/output/template_code_project/docx/template_code_project_combined.docx
@@ -651,7 +651,7 @@
         <w:t xml:space="preserve"> </w:t>
       </w:r>
       <w:r>
-        <w:t xml:space="preserve">ecosystem, demonstrating a fully-tested numerical optimization implementation securely bracketed by rigorous infrastructure, hermetic testing, and extensive documentation architectures. The prose, the labelled figures, and the labelled equations have all been programmably generated through an unbreakable custody chain starting from algorithm implementation through strict CI/CD validation to multi-format</w:t>
+        <w:t xml:space="preserve">ecosystem, demonstrating a fully-tested numerical optimization implementation bracketed by rigorous infrastructure, hermetic testing, and extensive documentation architectures. The prose, the labelled figures, and the labelled equations have all been generated through an auditable custody chain starting from algorithm implementation through strict CI/CD validation to multi-format</w:t>
       </w:r>
       <w:r>
         <w:t xml:space="preserve"> </w:t>
@@ -717,229 +717,7 @@
         <w:t xml:space="preserve">Layer (Root Directory)</w:t>
       </w:r>
       <w:r>
-        <w:t xml:space="preserve">: A modular stack of fifteen Python subpackages (</w:t>
-      </w:r>
-      <w:r>
-        <w:rPr>
-          <w:rStyle w:val="VerbatimChar"/>
-        </w:rPr>
-        <w:t xml:space="preserve">core</w:t>
-      </w:r>
-      <w:r>
-        <w:t xml:space="preserve">,</w:t>
-      </w:r>
-      <w:r>
-        <w:t xml:space="preserve"> </w:t>
-      </w:r>
-      <w:r>
-        <w:rPr>
-          <w:rStyle w:val="VerbatimChar"/>
-        </w:rPr>
-        <w:t xml:space="preserve">documentation</w:t>
-      </w:r>
-      <w:r>
-        <w:t xml:space="preserve">,</w:t>
-      </w:r>
-      <w:r>
-        <w:t xml:space="preserve"> </w:t>
-      </w:r>
-      <w:r>
-        <w:rPr>
-          <w:rStyle w:val="VerbatimChar"/>
-        </w:rPr>
-        <w:t xml:space="preserve">llm</w:t>
-      </w:r>
-      <w:r>
-        <w:t xml:space="preserve">,</w:t>
-      </w:r>
-      <w:r>
-        <w:t xml:space="preserve"> </w:t>
-      </w:r>
-      <w:r>
-        <w:rPr>
-          <w:rStyle w:val="VerbatimChar"/>
-        </w:rPr>
-        <w:t xml:space="preserve">orchestration</w:t>
-      </w:r>
-      <w:r>
-        <w:t xml:space="preserve">,</w:t>
-      </w:r>
-      <w:r>
-        <w:t xml:space="preserve"> </w:t>
-      </w:r>
-      <w:r>
-        <w:rPr>
-          <w:rStyle w:val="VerbatimChar"/>
-        </w:rPr>
-        <w:t xml:space="preserve">project</w:t>
-      </w:r>
-      <w:r>
-        <w:t xml:space="preserve">,</w:t>
-      </w:r>
-      <w:r>
-        <w:t xml:space="preserve"> </w:t>
-      </w:r>
-      <w:r>
-        <w:rPr>
-          <w:rStyle w:val="VerbatimChar"/>
-        </w:rPr>
-        <w:t xml:space="preserve">prose</w:t>
-      </w:r>
-      <w:r>
-        <w:t xml:space="preserve">,</w:t>
-      </w:r>
-      <w:r>
-        <w:t xml:space="preserve"> </w:t>
-      </w:r>
-      <w:r>
-        <w:rPr>
-          <w:rStyle w:val="VerbatimChar"/>
-        </w:rPr>
-        <w:t xml:space="preserve">publishing</w:t>
-      </w:r>
-      <w:r>
-        <w:t xml:space="preserve">,</w:t>
-      </w:r>
-      <w:r>
-        <w:t xml:space="preserve"> </w:t>
-      </w:r>
-      <w:r>
-        <w:rPr>
-          <w:rStyle w:val="VerbatimChar"/>
-        </w:rPr>
-        <w:t xml:space="preserve">reference</w:t>
-      </w:r>
-      <w:r>
-        <w:t xml:space="preserve">,</w:t>
-      </w:r>
-      <w:r>
-        <w:t xml:space="preserve"> </w:t>
-      </w:r>
-      <w:r>
-        <w:rPr>
-          <w:rStyle w:val="VerbatimChar"/>
-        </w:rPr>
-        <w:t xml:space="preserve">rendering</w:t>
-      </w:r>
-      <w:r>
-        <w:t xml:space="preserve">,</w:t>
-      </w:r>
-      <w:r>
-        <w:t xml:space="preserve"> </w:t>
-      </w:r>
-      <w:r>
-        <w:rPr>
-          <w:rStyle w:val="VerbatimChar"/>
-        </w:rPr>
-        <w:t xml:space="preserve">reporting</w:t>
-      </w:r>
-      <w:r>
-        <w:t xml:space="preserve">,</w:t>
-      </w:r>
-      <w:r>
-        <w:t xml:space="preserve"> </w:t>
-      </w:r>
-      <w:r>
-        <w:rPr>
-          <w:rStyle w:val="VerbatimChar"/>
-        </w:rPr>
-        <w:t xml:space="preserve">scientific</w:t>
-      </w:r>
-      <w:r>
-        <w:t xml:space="preserve">,</w:t>
-      </w:r>
-      <w:r>
-        <w:t xml:space="preserve"> </w:t>
-      </w:r>
-      <w:r>
-        <w:rPr>
-          <w:rStyle w:val="VerbatimChar"/>
-        </w:rPr>
-        <w:t xml:space="preserve">search</w:t>
-      </w:r>
-      <w:r>
-        <w:t xml:space="preserve">,</w:t>
-      </w:r>
-      <w:r>
-        <w:t xml:space="preserve"> </w:t>
-      </w:r>
-      <w:r>
-        <w:rPr>
-          <w:rStyle w:val="VerbatimChar"/>
-        </w:rPr>
-        <w:t xml:space="preserve">skills</w:t>
-      </w:r>
-      <w:r>
-        <w:t xml:space="preserve">,</w:t>
-      </w:r>
-      <w:r>
-        <w:t xml:space="preserve"> </w:t>
-      </w:r>
-      <w:r>
-        <w:rPr>
-          <w:rStyle w:val="VerbatimChar"/>
-        </w:rPr>
-        <w:t xml:space="preserve">steganography</w:t>
-      </w:r>
-      <w:r>
-        <w:t xml:space="preserve">,</w:t>
-      </w:r>
-      <w:r>
-        <w:t xml:space="preserve"> </w:t>
-      </w:r>
-      <w:r>
-        <w:rPr>
-          <w:rStyle w:val="VerbatimChar"/>
-        </w:rPr>
-        <w:t xml:space="preserve">validation</w:t>
-      </w:r>
-      <w:r>
-        <w:t xml:space="preserve">) providing the computational scaffolding (the sibling</w:t>
-      </w:r>
-      <w:r>
-        <w:t xml:space="preserve"> </w:t>
-      </w:r>
-      <w:r>
-        <w:rPr>
-          <w:rStyle w:val="VerbatimChar"/>
-        </w:rPr>
-        <w:t xml:space="preserve">config/</w:t>
-      </w:r>
-      <w:r>
-        <w:t xml:space="preserve"> </w:t>
-      </w:r>
-      <w:r>
-        <w:t xml:space="preserve">and</w:t>
-      </w:r>
-      <w:r>
-        <w:t xml:space="preserve"> </w:t>
-      </w:r>
-      <w:r>
-        <w:rPr>
-          <w:rStyle w:val="VerbatimChar"/>
-        </w:rPr>
-        <w:t xml:space="preserve">docker/</w:t>
-      </w:r>
-      <w:r>
-        <w:t xml:space="preserve"> </w:t>
-      </w:r>
-      <w:r>
-        <w:t xml:space="preserve">directories under</w:t>
-      </w:r>
-      <w:r>
-        <w:t xml:space="preserve"> </w:t>
-      </w:r>
-      <w:r>
-        <w:rPr>
-          <w:rStyle w:val="VerbatimChar"/>
-        </w:rPr>
-        <w:t xml:space="preserve">infrastructure/</w:t>
-      </w:r>
-      <w:r>
-        <w:t xml:space="preserve"> </w:t>
-      </w:r>
-      <w:r>
-        <w:t xml:space="preserve">are configuration/data, not Python packages).</w:t>
+        <w:t xml:space="preserve">: A modular stack of importable Python packages providing the computational scaffolding. The current package count is measured in the template repository’s generated canonical facts rather than repeated here because it changes as infrastructure modules are added or retired.</w:t>
       </w:r>
     </w:p>
     <w:p>
@@ -1312,7 +1090,7 @@
         <w:t xml:space="preserve">output_validator</w:t>
       </w:r>
       <w:r>
-        <w:t xml:space="preserve">) to ensure all generated artifacts are cryptographically sound.</w:t>
+        <w:t xml:space="preserve">) to ensure generated artifacts are structurally valid and traceable.</w:t>
       </w:r>
     </w:p>
     <w:p>
@@ -13610,7 +13388,7 @@
         <w:t xml:space="preserve">Ecosystem</w:t>
       </w:r>
       <w:r>
-        <w:t xml:space="preserve">: Fully leveraged the 15-package infrastructure cluster to handle scientific benchmarking, rendering, prose review, literature search, BibTeX validation, and reporting.</w:t>
+        <w:t xml:space="preserve">: Fully leveraged the measured infrastructure package cluster to handle scientific benchmarking, rendering, prose review, literature search, BibTeX validation, and reporting.</w:t>
       </w:r>
     </w:p>
     <w:p>
@@ -15118,7 +14896,7 @@
           <w:b/>
           <w:bCs/>
         </w:rPr>
-        <w:t xml:space="preserve">3.1 μs</w:t>
+        <w:t xml:space="preserve">1.9 μs</w:t>
       </w:r>
       <w:r>
         <w:t xml:space="preserve"> </w:t>
@@ -15222,7 +15000,7 @@
         <w:t xml:space="preserve">Generated</w:t>
       </w:r>
       <w:r>
-        <w:t xml:space="preserve">: 2026-05-22T00:46:04Z</w:t>
+        <w:t xml:space="preserve">: 2026-05-22T03:55:49Z</w:t>
       </w:r>
     </w:p>
     <w:bookmarkEnd w:id="84"/>

</xml_diff>